<commit_message>
feat: implement advanced feature gating, modular pricing configuration, and refined subscription tracking logic
</commit_message>
<xml_diff>
--- a/TenScrolls_Monetization_Plan.docx
+++ b/TenScrolls_Monetization_Plan.docx
@@ -36,6 +36,19 @@
           <w:sz w:val="22"/>
         </w:rPr>
         <w:t xml:space="preserve">TenScrolls Plus — Subscription, Trial &amp; Lifetime Unlock Strategy</w:t>
+      </w:r>
+    </w:p>
+    <w:p>
+      <w:pPr>
+        <w:spacing w:after="300"/>
+        <w:shd w:val="clear" w:fill="FFF4CE"/>
+      </w:pPr>
+      <w:r>
+        <w:rPr>
+          <w:b/>
+          <w:sz w:val="20"/>
+        </w:rPr>
+        <w:t xml:space="preserve">STATUS NOTE (corrected 2026-08-04): This is a pre-implementation plan, not the current state. The opening claim that "there is currently no payment code anywhere in the app" is now false — a full StoreKit 2 + Supabase subscription system has since been built (product ID ekme.TenScrolls.plus.monthly; see MONETIZATION_STATUS.md and TESTING_CHECKLIST.md for the real, current design). Some pieces here did ship largely as described (server-side leaderboard gating via 002_leaderboard_gating.sql; a tiered partial-reveal leaderboard for free/lapsed users). Others did not: what actually shipped gates Scroll II onward behind Plus with no Day-3/4 Caravan-trial framing, and Caravan's add-friend/cheer/group actions are NOT currently gated by subscription at all (a known, tracked gap — see MONETIZATION_STATUS.md's "Known gaps"), unlike the "Caravan: full leaderboard...add friend, cheers...requires Plus" split described below. The referenced "MONETIZATION_SCOPE.md" file does not exist in the current repo; the engineering detail now lives in MONETIZATION_STATUS.md instead. Treat everything below as historical planning context, not a build spec.</w:t>
       </w:r>
     </w:p>
     <w:p>

</xml_diff>